<commit_message>
Tighten report pagination after render review
Co-authored-by: choijunh-cloud <choijunh-cloud@users.noreply.github.com>
</commit_message>
<xml_diff>
--- a/lectures/8월 19일 시장전략 보고서 (매크로·반도체·주주환원).docx
+++ b/lectures/8월 19일 시장전략 보고서 (매크로·반도체·주주환원).docx
@@ -3638,11 +3638,6 @@
       </w:pPr>
     </w:p>
     <w:p>
-      <w:r>
-        <w:br w:type="page"/>
-      </w:r>
-    </w:p>
-    <w:p>
       <w:pPr>
         <w:spacing w:before="280" w:after="160" w:line="264" w:lineRule="auto"/>
         <w:pBdr>
@@ -6038,11 +6033,6 @@
       <w:pPr>
         <w:spacing w:after="160" w:before="40"/>
       </w:pPr>
-    </w:p>
-    <w:p>
-      <w:r>
-        <w:br w:type="page"/>
-      </w:r>
     </w:p>
     <w:p>
       <w:pPr>

</xml_diff>